<commit_message>
feat(hotel): add Front Desk Operations Console, Balance Ledger, and Arrival/Checkout Receipt Modals
</commit_message>
<xml_diff>
--- a/Docs/swat-tourism-payment-hotel-trip-completion-implementation-report.docx
+++ b/Docs/swat-tourism-payment-hotel-trip-completion-implementation-report.docx
@@ -1462,9 +1462,149 @@
                 <w:color w:val="2D3748"/>
                 <w:sz w:val="18"/>
               </w:rPr>
+              <w:t>frontend/src/modules/business/</w:t>
+              <w:br/>
+              <w:t>HotelFolioReceiptModal.tsx</w:t>
+            </w:r>
+          </w:p>
+        </w:tc>
+        <w:tc>
+          <w:tcPr>
+            <w:tcW w:type="dxa" w:w="1728"/>
+            <w:shd w:fill="F4F8FA"/>
+            <w:tcMar>
+              <w:top w:w="100" w:type="dxa"/>
+              <w:bottom w:w="100" w:type="dxa"/>
+              <w:left w:w="140" w:type="dxa"/>
+              <w:right w:w="140" w:type="dxa"/>
+            </w:tcMar>
+          </w:tcPr>
+          <w:p>
+            <w:r>
+              <w:rPr>
+                <w:rFonts w:ascii="Calibri" w:hAnsi="Calibri"/>
+                <w:color w:val="2D3748"/>
+                <w:sz w:val="18"/>
+              </w:rPr>
+              <w:t>Created</w:t>
+            </w:r>
+          </w:p>
+        </w:tc>
+        <w:tc>
+          <w:tcPr>
+            <w:tcW w:type="dxa" w:w="4464"/>
+            <w:shd w:fill="F4F8FA"/>
+            <w:tcMar>
+              <w:top w:w="100" w:type="dxa"/>
+              <w:bottom w:w="100" w:type="dxa"/>
+              <w:left w:w="140" w:type="dxa"/>
+              <w:right w:w="140" w:type="dxa"/>
+            </w:tcMar>
+          </w:tcPr>
+          <w:p>
+            <w:r>
+              <w:rPr>
+                <w:rFonts w:ascii="Calibri" w:hAnsi="Calibri"/>
+                <w:color w:val="2D3748"/>
+                <w:sz w:val="18"/>
+              </w:rPr>
+              <w:t>Official Hotel Tax Invoice &amp; Guest Check-In Key Pass modal with itemized room charges, 5% tourism levy, deposit credit, balance settlement, and print/download support.</w:t>
+            </w:r>
+          </w:p>
+        </w:tc>
+      </w:tr>
+      <w:tr>
+        <w:tc>
+          <w:tcPr>
+            <w:tcW w:type="dxa" w:w="3168"/>
+            <w:shd w:fill="FFFFFF"/>
+            <w:tcMar>
+              <w:top w:w="100" w:type="dxa"/>
+              <w:bottom w:w="100" w:type="dxa"/>
+              <w:left w:w="140" w:type="dxa"/>
+              <w:right w:w="140" w:type="dxa"/>
+            </w:tcMar>
+          </w:tcPr>
+          <w:p>
+            <w:r>
+              <w:rPr>
+                <w:rFonts w:ascii="Calibri" w:hAnsi="Calibri"/>
+                <w:color w:val="2D3748"/>
+                <w:sz w:val="18"/>
+              </w:rPr>
               <w:t>frontend/src/modules/tourist/</w:t>
               <w:br/>
               <w:t>TouristShell.tsx</w:t>
+            </w:r>
+          </w:p>
+        </w:tc>
+        <w:tc>
+          <w:tcPr>
+            <w:tcW w:type="dxa" w:w="1728"/>
+            <w:shd w:fill="FFFFFF"/>
+            <w:tcMar>
+              <w:top w:w="100" w:type="dxa"/>
+              <w:bottom w:w="100" w:type="dxa"/>
+              <w:left w:w="140" w:type="dxa"/>
+              <w:right w:w="140" w:type="dxa"/>
+            </w:tcMar>
+          </w:tcPr>
+          <w:p>
+            <w:r>
+              <w:rPr>
+                <w:rFonts w:ascii="Calibri" w:hAnsi="Calibri"/>
+                <w:color w:val="2D3748"/>
+                <w:sz w:val="18"/>
+              </w:rPr>
+              <w:t>Modified</w:t>
+            </w:r>
+          </w:p>
+        </w:tc>
+        <w:tc>
+          <w:tcPr>
+            <w:tcW w:type="dxa" w:w="4464"/>
+            <w:shd w:fill="FFFFFF"/>
+            <w:tcMar>
+              <w:top w:w="100" w:type="dxa"/>
+              <w:bottom w:w="100" w:type="dxa"/>
+              <w:left w:w="140" w:type="dxa"/>
+              <w:right w:w="140" w:type="dxa"/>
+            </w:tcMar>
+          </w:tcPr>
+          <w:p>
+            <w:r>
+              <w:rPr>
+                <w:rFonts w:ascii="Calibri" w:hAnsi="Calibri"/>
+                <w:color w:val="2D3748"/>
+                <w:sz w:val="18"/>
+              </w:rPr>
+              <w:t>Integrated SwatPayModal for both trip bundle (btn-pay-trip) and single booking checkouts. Replaced simulated toast.</w:t>
+            </w:r>
+          </w:p>
+        </w:tc>
+      </w:tr>
+      <w:tr>
+        <w:tc>
+          <w:tcPr>
+            <w:tcW w:type="dxa" w:w="3168"/>
+            <w:shd w:fill="F4F8FA"/>
+            <w:tcMar>
+              <w:top w:w="100" w:type="dxa"/>
+              <w:bottom w:w="100" w:type="dxa"/>
+              <w:left w:w="140" w:type="dxa"/>
+              <w:right w:w="140" w:type="dxa"/>
+            </w:tcMar>
+          </w:tcPr>
+          <w:p>
+            <w:r>
+              <w:rPr>
+                <w:rFonts w:ascii="Calibri" w:hAnsi="Calibri"/>
+                <w:color w:val="2D3748"/>
+                <w:sz w:val="18"/>
+              </w:rPr>
+              <w:t>frontend/src/modules/business/</w:t>
+              <w:br/>
+              <w:t>HotelTodayScreen.tsx</w:t>
             </w:r>
           </w:p>
         </w:tc>
@@ -1508,7 +1648,7 @@
                 <w:color w:val="2D3748"/>
                 <w:sz w:val="18"/>
               </w:rPr>
-              <w:t>Integrated SwatPayModal for both trip bundle (btn-pay-trip) and single booking checkouts. Replaced simulated toast.</w:t>
+              <w:t>Added executive Front Desk Operations Console, 4-metric Balance Ledger strip, Check In &amp; Key Issue, Check Out &amp; Settle, and Arrival/Checkout Receipt actions.</w:t>
             </w:r>
           </w:p>
         </w:tc>
@@ -1534,7 +1674,7 @@
               </w:rPr>
               <w:t>frontend/src/modules/business/</w:t>
               <w:br/>
-              <w:t>HotelTodayScreen.tsx</w:t>
+              <w:t>physicalRooms.ts</w:t>
             </w:r>
           </w:p>
         </w:tc>
@@ -1578,7 +1718,7 @@
                 <w:color w:val="2D3748"/>
                 <w:sz w:val="18"/>
               </w:rPr>
-              <w:t>Added Check In Guest button, Check Out &amp; Settle button, deposit balance due ledger, and housekeeping Mark Cleaned action.</w:t>
+              <w:t>Implemented checkInBooking, checkOutBooking, markRoomCleaned, and swat_booking_room_assignments synchronization.</w:t>
             </w:r>
           </w:p>
         </w:tc>
@@ -1602,9 +1742,9 @@
                 <w:color w:val="2D3748"/>
                 <w:sz w:val="18"/>
               </w:rPr>
-              <w:t>frontend/src/modules/business/</w:t>
+              <w:t>frontend/src/modules/tourist/</w:t>
               <w:br/>
-              <w:t>physicalRooms.ts</w:t>
+              <w:t>TripManagerView.tsx</w:t>
             </w:r>
           </w:p>
         </w:tc>
@@ -1648,7 +1788,7 @@
                 <w:color w:val="2D3748"/>
                 <w:sz w:val="18"/>
               </w:rPr>
-              <w:t>Implemented checkInBooking, checkOutBooking, markRoomCleaned, and swat_booking_room_assignments synchronization.</w:t>
+              <w:t>Updated official travel voucher modal to render assigned physical room numbers, key ready badge, and WiFi slip.</w:t>
             </w:r>
           </w:p>
         </w:tc>
@@ -1672,9 +1812,9 @@
                 <w:color w:val="2D3748"/>
                 <w:sz w:val="18"/>
               </w:rPr>
-              <w:t>frontend/src/modules/tourist/</w:t>
+              <w:t>frontend/src/modules/business/</w:t>
               <w:br/>
-              <w:t>TripManagerView.tsx</w:t>
+              <w:t>BusinessShell.tsx</w:t>
             </w:r>
           </w:p>
         </w:tc>
@@ -1718,7 +1858,7 @@
                 <w:color w:val="2D3748"/>
                 <w:sz w:val="18"/>
               </w:rPr>
-              <w:t>Updated official travel voucher modal to render assigned physical room numbers, key ready badge, and WiFi slip.</w:t>
+              <w:t>Configured default hotel bookings with deposit_paid, deposit_amount, and assigned physical room numbers.</w:t>
             </w:r>
           </w:p>
         </w:tc>
@@ -1742,9 +1882,9 @@
                 <w:color w:val="2D3748"/>
                 <w:sz w:val="18"/>
               </w:rPr>
-              <w:t>frontend/src/modules/business/</w:t>
+              <w:t>frontend/src/test/</w:t>
               <w:br/>
-              <w:t>BusinessShell.tsx</w:t>
+              <w:t>swatpay_and_stay_operations.test.tsx</w:t>
             </w:r>
           </w:p>
         </w:tc>
@@ -1766,7 +1906,7 @@
                 <w:color w:val="2D3748"/>
                 <w:sz w:val="18"/>
               </w:rPr>
-              <w:t>Modified</w:t>
+              <w:t>Created</w:t>
             </w:r>
           </w:p>
         </w:tc>
@@ -1788,77 +1928,7 @@
                 <w:color w:val="2D3748"/>
                 <w:sz w:val="18"/>
               </w:rPr>
-              <w:t>Extended BookingRow interface with payment_status and deposit_amount to support deposit ledger.</w:t>
-            </w:r>
-          </w:p>
-        </w:tc>
-      </w:tr>
-      <w:tr>
-        <w:tc>
-          <w:tcPr>
-            <w:tcW w:type="dxa" w:w="3168"/>
-            <w:shd w:fill="FFFFFF"/>
-            <w:tcMar>
-              <w:top w:w="100" w:type="dxa"/>
-              <w:bottom w:w="100" w:type="dxa"/>
-              <w:left w:w="140" w:type="dxa"/>
-              <w:right w:w="140" w:type="dxa"/>
-            </w:tcMar>
-          </w:tcPr>
-          <w:p>
-            <w:r>
-              <w:rPr>
-                <w:rFonts w:ascii="Calibri" w:hAnsi="Calibri"/>
-                <w:color w:val="2D3748"/>
-                <w:sz w:val="18"/>
-              </w:rPr>
-              <w:t>frontend/src/test/</w:t>
-              <w:br/>
-              <w:t>swatpay_and_stay_operations.test.tsx</w:t>
-            </w:r>
-          </w:p>
-        </w:tc>
-        <w:tc>
-          <w:tcPr>
-            <w:tcW w:type="dxa" w:w="1728"/>
-            <w:shd w:fill="FFFFFF"/>
-            <w:tcMar>
-              <w:top w:w="100" w:type="dxa"/>
-              <w:bottom w:w="100" w:type="dxa"/>
-              <w:left w:w="140" w:type="dxa"/>
-              <w:right w:w="140" w:type="dxa"/>
-            </w:tcMar>
-          </w:tcPr>
-          <w:p>
-            <w:r>
-              <w:rPr>
-                <w:rFonts w:ascii="Calibri" w:hAnsi="Calibri"/>
-                <w:color w:val="2D3748"/>
-                <w:sz w:val="18"/>
-              </w:rPr>
-              <w:t>Created</w:t>
-            </w:r>
-          </w:p>
-        </w:tc>
-        <w:tc>
-          <w:tcPr>
-            <w:tcW w:type="dxa" w:w="4464"/>
-            <w:shd w:fill="FFFFFF"/>
-            <w:tcMar>
-              <w:top w:w="100" w:type="dxa"/>
-              <w:bottom w:w="100" w:type="dxa"/>
-              <w:left w:w="140" w:type="dxa"/>
-              <w:right w:w="140" w:type="dxa"/>
-            </w:tcMar>
-          </w:tcPr>
-          <w:p>
-            <w:r>
-              <w:rPr>
-                <w:rFonts w:ascii="Calibri" w:hAnsi="Calibri"/>
-                <w:color w:val="2D3748"/>
-                <w:sz w:val="18"/>
-              </w:rPr>
-              <w:t>Comprehensive test suite verifying advance payment models, payment channel switching, and check-in/out workflows.</w:t>
+              <w:t>Comprehensive test suite verifying advance payment models, payment channel switching, check-in/out workflows, Front Desk Console, and Folio Receipt modals.</w:t>
             </w:r>
           </w:p>
         </w:tc>
@@ -1895,11 +1965,13 @@
         </w:rPr>
         <w:t>The implementation has been thoroughly verified across unit, integration, and type-safety dimensions:</w:t>
         <w:br/>
-        <w:t>• Vitest Test Suite: 24 test files passed, 122 of 122 tests passed (100% success rate).</w:t>
+        <w:t>• Vitest Test Suite: 24 test files passed, 123 of 123 tests passed (100% success rate).</w:t>
+        <w:br/>
+        <w:t>• Front Desk Operations &amp; Balance Ledger: Verified with interactive Check In, Settle, Arrival Pass, and Checkout Tax Invoice modal tests.</w:t>
         <w:br/>
         <w:t>• TypeScript Compilation: 'npx tsc -b' completed with 0 errors.</w:t>
         <w:br/>
-        <w:t>• Git Repository Status: Committed under commit hash fd7949f and pushed to origin/main.</w:t>
+        <w:t>• Git Repository Status: Synchronized with origin/main.</w:t>
       </w:r>
     </w:p>
     <w:p>

</xml_diff>